<commit_message>
Finalize research plan audit follow-up
</commit_message>
<xml_diff>
--- a/WhatIWrote/Doctoral_Research_Plan_5p_ENG.docx
+++ b/WhatIWrote/Doctoral_Research_Plan_5p_ENG.docx
@@ -50,7 +50,7 @@
     </w:p>
     <w:p>
       <w:r>
-        <w:t>YouTube is an especially useful site for this purpose because video messages, comment responses, and actor clustering accumulate on the same platform. The South Korean scope is defined through Korean-language climate-related videos and comment threads that are publicly searchable and substantively connected to South Korean channels, audiences, or issues. This design makes it possible to analyze discursive dynamics across expression in videos, reaction in comments, and forms of actor clustering rather than treating them as separate processes (Allgaier, 2019; Shapiro &amp; Park, 2018; Lim et al., 2021).</w:t>
+        <w:t>YouTube is an especially useful site for this purpose because scientific information, personal experiences, political claims, and distorted climate-related content circulate on the same platform, where video messages can be linked to comment responses (Allgaier, 2019; Shapiro &amp; Park, 2018). Although exposure is shaped by recommendation and personalization, the publicly searchable layer still makes it possible to build a comparatively reproducible longitudinal dataset. This project therefore focuses on Korean-language climate-related YouTube materials that are substantively connected to South Korean channels, audiences, or issues. Prior Korean studies have examined the topic structure and terminology of climate-related YouTube content in South Korea (Lim et al., 2021; Lim, 2023).</w:t>
       </w:r>
     </w:p>
     <w:p/>
@@ -168,7 +168,7 @@
     </w:p>
     <w:p>
       <w:r>
-        <w:t>Actor-network analysis will begin with a bipartite commenter-creator network derived from comment participation. This makes it possible to identify which channels repeatedly attract concentrated responses and which participant clusters are assembled around them. When analytically useful, supplementary indicators such as channel-to-channel connections or co-reference structures in text can also be examined. Centrality measures and community-detection techniques will be used to relate network reconfiguration to topic composition and sentiment-attitude distributions over time (Traag et al., 2019).</w:t>
+        <w:t>Actor-network analysis will begin with a bipartite commenter-creator network derived from comment participation. This makes it possible to identify which channels repeatedly attract concentrated responses and which participant clusters are assembled around them. When analytically useful, supplementary indicators such as channel-to-channel connections or co-reference structures in text can also be examined. Centrality measures and community-detection techniques will be used to relate network reconfiguration to topic composition and sentiment-attitude distributions over time (Newman, 2010; Traag et al., 2019).</w:t>
       </w:r>
     </w:p>
     <w:p/>
@@ -222,6 +222,12 @@
     <w:p>
       <w:r>
         <w:t>Hilgartner, S., &amp; Bosk, C. L. (1988). The rise and fall of social problems: A public arenas model. American Journal of Sociology, 94(1), 53-78.</w:t>
+      </w:r>
+    </w:p>
+    <w:p>
+      <w:pPr/>
+      <w:r>
+        <w:t>Newman, M. E. J. (2010). Networks: An introduction. Oxford University Press.</w:t>
       </w:r>
     </w:p>
     <w:p>

</xml_diff>